<commit_message>
Manifesto: voice pass on v1.1
Fix the documented voice-rule breaks and reconcile the subtitle:
- Subtitle "A Discipline of AI Consumption" -> "The Discipline of the Flow"
  to match the public tagline.
- Remove the OpenRouter/PMT stock-market aside; replace with an in-register
  line on daily price movement.
- Rewrite the "being a sucker... this is capitalism, after all" passage to
  "a price-taker, and it will be priced accordingly" (drops the humor/irony).
- Rewrite the closing method note to the approved research-project framing,
  removing the non-disclosure breach (locked registry / axioms / propositions
  / theorems / dependency graph) that would have exposed the private system
  in a public PDF.
- Typo: "sprialin" -> "spiraling".
Verified clean: no banned vocab, no non-disclosure terms, no em dashes.

Co-Authored-By: Claude Opus 4.8 (1M context) <noreply@anthropic.com>
</commit_message>
<xml_diff>
--- a/planning/AI Operations Management 7.10.2026.docx
+++ b/planning/AI Operations Management 7.10.2026.docx
@@ -38,7 +38,7 @@
           <w:szCs w:val="30"/>
           <w:rtl w:val="0"/>
         </w:rPr>
-        <w:t xml:space="preserve">A </w:t>
+        <w:t>The Discipline of the Flow</w:t>
       </w:r>
       <w:r>
         <w:rPr>
@@ -49,7 +49,6 @@
           <w:szCs w:val="30"/>
           <w:rtl w:val="0"/>
         </w:rPr>
-        <w:t xml:space="preserve">Discipline of AI Consumption</w:t>
       </w:r>
       <w:r>
         <w:rPr>
@@ -169,13 +168,13 @@
           <w:szCs w:val="22"/>
           <w:rtl w:val="0"/>
         </w:rPr>
-        <w:t xml:space="preserve">The pricing on the invoice does not change this. An organization paying a flat rate for AI access may conclude that its consumption is economically irrelevant, and that the subscription has converted a variable cost back into a fixed one. It has not. Flat pricing conceals the consumption; it does not eliminate it. The underlying resource expenditure remains variable, remains real, and is borne in the first instance by the AI provider, whose own economics are anything but flat. An AI provider carrying variable costs against fixed revenue faces a structural mismatch that will not last. It resolves through meters, usage tiers, rate limits, throttling, priority access, or repricing. Every one of these mechanisms is already visible in the AI market. Just track the </w:t>
-      </w:r>
-      <w:r>
-        <w:rPr>
-          <w:rtl w:val="0"/>
-        </w:rPr>
-        <w:t xml:space="preserve">PMT (price per million tokens) daily changes on OpenRouter, like the stock market. </w:t>
+        <w:t xml:space="preserve">The pricing on the invoice does not change this. An organization paying a flat rate for AI access may conclude that its consumption is economically irrelevant, and that the subscription has converted a variable cost back into a fixed one. It has not. Flat pricing conceals the consumption; it does not eliminate it. The underlying resource expenditure remains variable, remains real, and is borne in the first instance by the AI provider, whose own economics are anything but flat. An AI provider carrying variable costs against fixed revenue faces a structural mismatch that will not last. It resolves through meters, usage tiers, rate limits, throttling, priority access, or repricing. Every one of these mechanisms is already visible in the AI market. </w:t>
+      </w:r>
+      <w:r>
+        <w:rPr>
+          <w:rtl w:val="0"/>
+        </w:rPr>
+        <w:t xml:space="preserve">The price of a unit of AI capacity already moves from one day to the next. </w:t>
       </w:r>
       <w:r>
         <w:rPr>
@@ -382,7 +381,7 @@
         <w:rPr>
           <w:rtl w:val="0"/>
         </w:rPr>
-        <w:t xml:space="preserve">sprialin </w:t>
+        <w:t xml:space="preserve">spiraling </w:t>
       </w:r>
       <w:r>
         <w:rPr>
@@ -550,7 +549,7 @@
         <w:rPr>
           <w:rtl w:val="0"/>
         </w:rPr>
-        <w:t xml:space="preserve">is called being a sucker and asking to be exploited by the supplier. This is capitalism, after all.</w:t>
+        <w:t>is a price-taker, and it will be priced accordingly.</w:t>
       </w:r>
     </w:p>
     <w:p>
@@ -1829,7 +1828,7 @@
           <w:szCs w:val="22"/>
           <w:rtl w:val="0"/>
         </w:rPr>
-        <w:t xml:space="preserve">A note on method. This document is the public face of a formal project. Every claim it makes traces to a locked registry of definitions, axioms, propositions, and theorems, maintained under version control and assembled as a dependency graph, so that each conclusion can be walked backward to the premises that carry it. Volume 1 asserts nothing the registry does not support. Readers who want the formal layer are invited to ask for it.</w:t>
+        <w:t>A note on method. This document is the public face of a broader research project on the economics of business AI adoption. Every claim it makes rests on a documented research base, maintained so that each conclusion can be traced back to the premises that carry it. This volume asserts nothing that base does not support. Readers who want the underlying research are invited to ask for it.</w:t>
       </w:r>
       <w:r>
         <w:rPr>

</xml_diff>

<commit_message>
Manifesto: back the §4 cost-control claim with MIT + S&P evidence
Replace the unsourced "many times with Fortune 500 companies" assertion
with two citable findings (MIT State of AI in Business 2025: 95% of GenAI
pilots show no measurable P&L impact; S&P Global: AI-initiative abandonment
more than doubled in a year), then draw the value-boundary conclusion in
the manifesto's own voice. Regenerated the PDF from the edited docx.

Co-Authored-By: Claude Opus 4.8 (1M context) <noreply@anthropic.com>
</commit_message>
<xml_diff>
--- a/planning/AI Operations Management 7.10.2026.docx
+++ b/planning/AI Operations Management 7.10.2026.docx
@@ -1396,30 +1396,27 @@
           <w:szCs w:val="22"/>
           <w:rtl w:val="0"/>
         </w:rPr>
-        <w:t xml:space="preserve">Five functions, one </w:t>
-      </w:r>
-      <w:r>
-        <w:rPr>
-          <w:rtl w:val="0"/>
-        </w:rPr>
-        <w:t xml:space="preserve">all-encompassing</w:t>
-      </w:r>
-      <w:r>
-        <w:rPr>
-          <w:rFonts w:ascii="Georgia" w:cs="Georgia" w:eastAsia="Georgia" w:hAnsi="Georgia"/>
-          <w:i w:val="0"/>
-          <w:iCs w:val="0"/>
-          <w:sz w:val="22"/>
-          <w:szCs w:val="22"/>
-          <w:rtl w:val="0"/>
-        </w:rPr>
-        <w:t xml:space="preserve"> flow. Sourcing feeds it, planning anticipates it, metering and attribution see it, allocation disciplines it, and the value boundary makes it answer for itself. An organization performing all five is practicing AI Operations Management, whatever it calls the department. An organization performing none of them is not avoiding the discipline. </w:t>
-      </w:r>
-      <w:r>
-        <w:rPr>
-          <w:rtl w:val="0"/>
-        </w:rPr>
-        <w:t xml:space="preserve">It is abdicating one of the basic tenets of all business, cost control. We have already seen this play out many times with Fortune 500 companies that turned on AI without any operations management guardrails.</w:t>
+        <w:t>Five functions, one all-encompassing flow. Sourcing feeds it, planning anticipates it, metering and attribution see it, allocation disciplines it, and the value boundary makes it answer for itself. An organization performing all five is practicing AI Operations Management, whatever it calls the department. An organization performing none of them is not avoiding the discipline. It is abdicating one of the basic tenets of all business, cost control. We have already seen this play out. In 2025, MIT's State of AI in Business report found that 95 percent of enterprise generative AI pilots produced no measurable effect on the P&amp;L, and S&amp;P Global found the share of companies abandoning an AI initiative more than doubled in a single year. The spend arrived on schedule. The value was never made to answer for it.</w:t>
+      </w:r>
+      <w:r>
+        <w:rPr>
+          <w:rtl w:val="0"/>
+        </w:rPr>
+      </w:r>
+      <w:r>
+        <w:rPr>
+          <w:rFonts w:ascii="Georgia" w:cs="Georgia" w:eastAsia="Georgia" w:hAnsi="Georgia"/>
+          <w:i w:val="0"/>
+          <w:iCs w:val="0"/>
+          <w:sz w:val="22"/>
+          <w:szCs w:val="22"/>
+          <w:rtl w:val="0"/>
+        </w:rPr>
+      </w:r>
+      <w:r>
+        <w:rPr>
+          <w:rtl w:val="0"/>
+        </w:rPr>
       </w:r>
     </w:p>
     <w:p>

</xml_diff>